<commit_message>
agregado de 3 planchas.
</commit_message>
<xml_diff>
--- a/Informe_TP_Integrador.docx
+++ b/Informe_TP_Integrador.docx
@@ -83,13 +83,8 @@
         <w:t xml:space="preserve">Local estudiado: </w:t>
       </w:r>
       <w:r>
-        <w:t xml:space="preserve">Malevo </w:t>
+        <w:t>Malevo Chegusanes</w:t>
       </w:r>
-      <w:proofErr w:type="spellStart"/>
-      <w:r>
-        <w:t>Chegusanes</w:t>
-      </w:r>
-      <w:proofErr w:type="spellEnd"/>
     </w:p>
     <w:p/>
     <w:p>
@@ -382,21 +377,7 @@
               <w:rPr>
                 <w:sz w:val="16"/>
               </w:rPr>
-              <w:t xml:space="preserve">Entrega por </w:t>
-            </w:r>
-            <w:proofErr w:type="spellStart"/>
-            <w:r>
-              <w:rPr>
-                <w:sz w:val="16"/>
-              </w:rPr>
-              <w:t>delivery</w:t>
-            </w:r>
-            <w:proofErr w:type="spellEnd"/>
-            <w:r>
-              <w:rPr>
-                <w:sz w:val="16"/>
-              </w:rPr>
-              <w:t xml:space="preserve"> o pickup</w:t>
+              <w:t>Entrega por delivery o pickup</w:t>
             </w:r>
           </w:p>
         </w:tc>
@@ -745,7 +726,6 @@
             <w:pPr>
               <w:spacing w:after="0"/>
             </w:pPr>
-            <w:proofErr w:type="spellStart"/>
             <w:r>
               <w:rPr>
                 <w:rFonts w:ascii="Consolas" w:hAnsi="Consolas"/>
@@ -753,14 +733,12 @@
               </w:rPr>
               <w:t>pedidosPorHora</w:t>
             </w:r>
-            <w:proofErr w:type="spellEnd"/>
             <w:r>
               <w:rPr>
                 <w:sz w:val="16"/>
               </w:rPr>
               <w:t xml:space="preserve">, </w:t>
             </w:r>
-            <w:proofErr w:type="spellStart"/>
             <w:r>
               <w:rPr>
                 <w:rFonts w:ascii="Consolas" w:hAnsi="Consolas"/>
@@ -768,14 +746,12 @@
               </w:rPr>
               <w:t>hamburguesasMin</w:t>
             </w:r>
-            <w:proofErr w:type="spellEnd"/>
             <w:r>
               <w:rPr>
                 <w:sz w:val="16"/>
               </w:rPr>
               <w:t xml:space="preserve">, </w:t>
             </w:r>
-            <w:proofErr w:type="spellStart"/>
             <w:r>
               <w:rPr>
                 <w:rFonts w:ascii="Consolas" w:hAnsi="Consolas"/>
@@ -783,7 +759,6 @@
               </w:rPr>
               <w:t>hamburguesasMax</w:t>
             </w:r>
-            <w:proofErr w:type="spellEnd"/>
           </w:p>
         </w:tc>
       </w:tr>
@@ -820,31 +795,13 @@
                 <w:rFonts w:ascii="Consolas" w:hAnsi="Consolas"/>
               </w:rPr>
             </w:pPr>
-            <w:proofErr w:type="spellStart"/>
             <w:r>
               <w:rPr>
                 <w:rFonts w:ascii="Consolas" w:hAnsi="Consolas"/>
                 <w:sz w:val="16"/>
               </w:rPr>
-              <w:t>porcentajeEspeciales</w:t>
+              <w:t>porcentajeEspeciales, porcentajeConPapas</w:t>
             </w:r>
-            <w:proofErr w:type="spellEnd"/>
-            <w:r>
-              <w:rPr>
-                <w:rFonts w:ascii="Consolas" w:hAnsi="Consolas"/>
-                <w:sz w:val="16"/>
-              </w:rPr>
-              <w:t xml:space="preserve">, </w:t>
-            </w:r>
-            <w:proofErr w:type="spellStart"/>
-            <w:r>
-              <w:rPr>
-                <w:rFonts w:ascii="Consolas" w:hAnsi="Consolas"/>
-                <w:sz w:val="16"/>
-              </w:rPr>
-              <w:t>porcentajeConPapas</w:t>
-            </w:r>
-            <w:proofErr w:type="spellEnd"/>
           </w:p>
         </w:tc>
       </w:tr>
@@ -881,37 +838,12 @@
                 <w:rFonts w:ascii="Consolas" w:hAnsi="Consolas"/>
               </w:rPr>
             </w:pPr>
-            <w:proofErr w:type="spellStart"/>
             <w:r>
               <w:rPr>
                 <w:rFonts w:ascii="Consolas" w:hAnsi="Consolas"/>
                 <w:sz w:val="16"/>
               </w:rPr>
-              <w:t>cocinerosPlancha</w:t>
-            </w:r>
-            <w:proofErr w:type="spellEnd"/>
-            <w:r>
-              <w:rPr>
-                <w:rFonts w:ascii="Consolas" w:hAnsi="Consolas"/>
-                <w:sz w:val="16"/>
-              </w:rPr>
-              <w:t xml:space="preserve">, </w:t>
-            </w:r>
-            <w:proofErr w:type="spellStart"/>
-            <w:r>
-              <w:rPr>
-                <w:rFonts w:ascii="Consolas" w:hAnsi="Consolas"/>
-                <w:sz w:val="16"/>
-              </w:rPr>
-              <w:t>personasArmado</w:t>
-            </w:r>
-            <w:proofErr w:type="spellEnd"/>
-            <w:r>
-              <w:rPr>
-                <w:rFonts w:ascii="Consolas" w:hAnsi="Consolas"/>
-                <w:sz w:val="16"/>
-              </w:rPr>
-              <w:t>, capacidades de tanda</w:t>
+              <w:t>cocinerosPlancha, personasArmado, capacidades de tanda</w:t>
             </w:r>
           </w:p>
         </w:tc>
@@ -1455,23 +1387,7 @@
     </w:p>
     <w:p>
       <w:r>
-        <w:t xml:space="preserve">El modelo </w:t>
-      </w:r>
-      <w:proofErr w:type="spellStart"/>
-      <w:r>
-        <w:t>Simulacion</w:t>
-      </w:r>
-      <w:proofErr w:type="spellEnd"/>
-      <w:r>
-        <w:t xml:space="preserve"> fue implementado en </w:t>
-      </w:r>
-      <w:proofErr w:type="spellStart"/>
-      <w:r>
-        <w:t>Modelica</w:t>
-      </w:r>
-      <w:proofErr w:type="spellEnd"/>
-      <w:r>
-        <w:t xml:space="preserve"> como un sistema de eventos discretos. Cada evento representa una llegada, una finalización de cocción o una finalización de armado. Las colas conservan identificador, cantidad, composición, llegada y duración de cada pedido.</w:t>
+        <w:t>El modelo Simulacion fue implementado en Modelica como un sistema de eventos discretos. Cada evento representa una llegada, una finalización de cocción o una finalización de armado. Las colas conservan identificador, cantidad, composición, llegada y duración de cada pedido.</w:t>
       </w:r>
     </w:p>
     <w:p>
@@ -1485,20 +1401,21 @@
     <w:p>
       <w:pPr>
         <w:pStyle w:val="ListBullet"/>
+        <w:numPr>
+          <w:ilvl w:val="0"/>
+          <w:numId w:val="10"/>
+        </w:numPr>
         <w:spacing w:after="20"/>
-        <w:ind w:left="255" w:hanging="113"/>
       </w:pPr>
       <w:r>
         <w:t xml:space="preserve">Las llegadas siguen un proceso aleatorio definido por </w:t>
       </w:r>
-      <w:proofErr w:type="spellStart"/>
       <w:r>
         <w:rPr>
           <w:rFonts w:ascii="Consolas" w:hAnsi="Consolas"/>
         </w:rPr>
         <w:t>pedidosPorHora</w:t>
       </w:r>
-      <w:proofErr w:type="spellEnd"/>
       <w:r>
         <w:t>.</w:t>
       </w:r>
@@ -1506,8 +1423,11 @@
     <w:p>
       <w:pPr>
         <w:pStyle w:val="ListBullet"/>
+        <w:numPr>
+          <w:ilvl w:val="0"/>
+          <w:numId w:val="10"/>
+        </w:numPr>
         <w:spacing w:after="20"/>
-        <w:ind w:left="255" w:hanging="113"/>
       </w:pPr>
       <w:r>
         <w:t>Cada hamburguesa se clasifica aleatoriamente como simple o especial y puede incluir papas.</w:t>
@@ -1516,8 +1436,11 @@
     <w:p>
       <w:pPr>
         <w:pStyle w:val="ListBullet"/>
+        <w:numPr>
+          <w:ilvl w:val="0"/>
+          <w:numId w:val="10"/>
+        </w:numPr>
         <w:spacing w:after="20"/>
-        <w:ind w:left="255" w:hanging="113"/>
       </w:pPr>
       <w:r>
         <w:t>Los pedidos ingresan a cocción si existe capacidad conjunta de hamburguesas y papas.</w:t>
@@ -1526,8 +1449,11 @@
     <w:p>
       <w:pPr>
         <w:pStyle w:val="ListBullet"/>
+        <w:numPr>
+          <w:ilvl w:val="0"/>
+          <w:numId w:val="10"/>
+        </w:numPr>
         <w:spacing w:after="20"/>
-        <w:ind w:left="255" w:hanging="113"/>
       </w:pPr>
       <w:r>
         <w:t>La cocción considera simultaneidad mediante máximos de tiempos y agrega atención manual.</w:t>
@@ -1536,8 +1462,11 @@
     <w:p>
       <w:pPr>
         <w:pStyle w:val="ListBullet"/>
+        <w:numPr>
+          <w:ilvl w:val="0"/>
+          <w:numId w:val="10"/>
+        </w:numPr>
         <w:spacing w:after="20"/>
-        <w:ind w:left="255" w:hanging="113"/>
       </w:pPr>
       <w:r>
         <w:t>Después de cocinar, el pedido espera un puesto de armado y finalmente queda terminado.</w:t>
@@ -1546,17 +1475,18 @@
     <w:p>
       <w:pPr>
         <w:pStyle w:val="ListBullet"/>
+        <w:numPr>
+          <w:ilvl w:val="0"/>
+          <w:numId w:val="10"/>
+        </w:numPr>
         <w:spacing w:after="20"/>
-        <w:ind w:left="255" w:hanging="113"/>
       </w:pPr>
-      <w:proofErr w:type="spellStart"/>
       <w:r>
         <w:rPr>
           <w:rFonts w:ascii="Consolas" w:hAnsi="Consolas"/>
         </w:rPr>
         <w:t>cocinerosPlancha</w:t>
       </w:r>
-      <w:proofErr w:type="spellEnd"/>
       <w:r>
         <w:t xml:space="preserve"> reduce la carga de atención manual; no modifica la capacidad física agregada.</w:t>
       </w:r>
@@ -1796,21 +1726,7 @@
               <w:rPr>
                 <w:sz w:val="15"/>
               </w:rPr>
-              <w:t xml:space="preserve">Sin </w:t>
-            </w:r>
-            <w:proofErr w:type="spellStart"/>
-            <w:r>
-              <w:rPr>
-                <w:sz w:val="15"/>
-              </w:rPr>
-              <w:t>delivery</w:t>
-            </w:r>
-            <w:proofErr w:type="spellEnd"/>
-            <w:r>
-              <w:rPr>
-                <w:sz w:val="15"/>
-              </w:rPr>
-              <w:t xml:space="preserve"> ni atención</w:t>
+              <w:t>Sin delivery ni atención</w:t>
             </w:r>
           </w:p>
         </w:tc>
@@ -1847,33 +1763,24 @@
       </w:r>
     </w:p>
     <w:p>
-      <w:proofErr w:type="spellStart"/>
       <w:r>
-        <w:t>OpenModelica</w:t>
+        <w:t xml:space="preserve">OpenModelica verificó el modelo correctamente. Se incorporaron aserciones para conservación de pedidos, clasificación de hamburguesas y límites de capacidad. En las corridas estadísticas, </w:t>
       </w:r>
-      <w:proofErr w:type="spellEnd"/>
-      <w:r>
-        <w:t xml:space="preserve"> verificó el modelo correctamente. Se incorporaron aserciones para conservación de pedidos, clasificación de hamburguesas y límites de capacidad. En las corridas estadísticas, </w:t>
-      </w:r>
-      <w:proofErr w:type="spellStart"/>
       <w:r>
         <w:rPr>
           <w:rFonts w:ascii="Consolas" w:hAnsi="Consolas"/>
         </w:rPr>
         <w:t>balancePedidos</w:t>
       </w:r>
-      <w:proofErr w:type="spellEnd"/>
       <w:r>
         <w:t xml:space="preserve"> y </w:t>
       </w:r>
-      <w:proofErr w:type="spellStart"/>
       <w:r>
         <w:rPr>
           <w:rFonts w:ascii="Consolas" w:hAnsi="Consolas"/>
         </w:rPr>
         <w:t>balanceHamburguesas</w:t>
       </w:r>
-      <w:proofErr w:type="spellEnd"/>
       <w:r>
         <w:t xml:space="preserve"> finalizaron en cero. Las semillas permiten reproducir cada corrida y utilizar la misma demanda al comparar escenarios. La validación es parcial: los tiempos se contrastaron con los rangos informados, pero faltan registros históricos detallados para una calibración independiente.</w:t>
       </w:r>
@@ -2352,6 +2259,207 @@
       </w:r>
     </w:p>
     <w:p>
+      <w:r>
+        <w:t>Gr</w:t>
+      </w:r>
+      <w:r>
+        <w:t>á</w:t>
+      </w:r>
+      <w:r>
+        <w:t>ficos de evoluci</w:t>
+      </w:r>
+      <w:r>
+        <w:t>ó</w:t>
+      </w:r>
+      <w:r>
+        <w:t>n de la simulaci</w:t>
+      </w:r>
+      <w:r>
+        <w:t>ó</w:t>
+      </w:r>
+      <w:r>
+        <w:t>n</w:t>
+      </w:r>
+    </w:p>
+    <w:p>
+      <w:r>
+        <w:rPr>
+          <w:noProof/>
+        </w:rPr>
+        <w:drawing>
+          <wp:inline distT="0" distB="0" distL="0" distR="0" wp14:anchorId="5054C9B3" wp14:editId="5FCABBE8">
+            <wp:extent cx="5760720" cy="3275964"/>
+            <wp:effectExtent l="0" t="0" r="0" b="0"/>
+            <wp:docPr id="2" name="Picture 2"/>
+            <wp:cNvGraphicFramePr>
+              <a:graphicFrameLocks xmlns:a="http://schemas.openxmlformats.org/drawingml/2006/main" noChangeAspect="1"/>
+            </wp:cNvGraphicFramePr>
+            <a:graphic xmlns:a="http://schemas.openxmlformats.org/drawingml/2006/main">
+              <a:graphicData uri="http://schemas.openxmlformats.org/drawingml/2006/picture">
+                <pic:pic xmlns:pic="http://schemas.openxmlformats.org/drawingml/2006/picture">
+                  <pic:nvPicPr>
+                    <pic:cNvPr id="0" name="grafico_pedidos_modelica.png"/>
+                    <pic:cNvPicPr/>
+                  </pic:nvPicPr>
+                  <pic:blipFill>
+                    <a:blip r:embed="rId9"/>
+                    <a:stretch>
+                      <a:fillRect/>
+                    </a:stretch>
+                  </pic:blipFill>
+                  <pic:spPr>
+                    <a:xfrm>
+                      <a:off x="0" y="0"/>
+                      <a:ext cx="5760720" cy="3275964"/>
+                    </a:xfrm>
+                    <a:prstGeom prst="rect">
+                      <a:avLst/>
+                    </a:prstGeom>
+                  </pic:spPr>
+                </pic:pic>
+              </a:graphicData>
+            </a:graphic>
+          </wp:inline>
+        </w:drawing>
+      </w:r>
+    </w:p>
+    <w:p>
+      <w:r>
+        <w:t>Figura 2. Evoluci</w:t>
+      </w:r>
+      <w:r>
+        <w:t>ó</w:t>
+      </w:r>
+      <w:r>
+        <w:t>n de pedidos recibidos y terminados durante el turno simulado.</w:t>
+      </w:r>
+    </w:p>
+    <w:p>
+      <w:r>
+        <w:rPr>
+          <w:noProof/>
+        </w:rPr>
+        <w:lastRenderedPageBreak/>
+        <w:drawing>
+          <wp:inline distT="0" distB="0" distL="0" distR="0" wp14:anchorId="7F9791FD" wp14:editId="74C88786">
+            <wp:extent cx="5760720" cy="3275964"/>
+            <wp:effectExtent l="0" t="0" r="0" b="0"/>
+            <wp:docPr id="3" name="Picture 3"/>
+            <wp:cNvGraphicFramePr>
+              <a:graphicFrameLocks xmlns:a="http://schemas.openxmlformats.org/drawingml/2006/main" noChangeAspect="1"/>
+            </wp:cNvGraphicFramePr>
+            <a:graphic xmlns:a="http://schemas.openxmlformats.org/drawingml/2006/main">
+              <a:graphicData uri="http://schemas.openxmlformats.org/drawingml/2006/picture">
+                <pic:pic xmlns:pic="http://schemas.openxmlformats.org/drawingml/2006/picture">
+                  <pic:nvPicPr>
+                    <pic:cNvPr id="0" name="grafico_tiempos_modelica.png"/>
+                    <pic:cNvPicPr/>
+                  </pic:nvPicPr>
+                  <pic:blipFill>
+                    <a:blip r:embed="rId10"/>
+                    <a:stretch>
+                      <a:fillRect/>
+                    </a:stretch>
+                  </pic:blipFill>
+                  <pic:spPr>
+                    <a:xfrm>
+                      <a:off x="0" y="0"/>
+                      <a:ext cx="5760720" cy="3275964"/>
+                    </a:xfrm>
+                    <a:prstGeom prst="rect">
+                      <a:avLst/>
+                    </a:prstGeom>
+                  </pic:spPr>
+                </pic:pic>
+              </a:graphicData>
+            </a:graphic>
+          </wp:inline>
+        </w:drawing>
+      </w:r>
+    </w:p>
+    <w:p>
+      <w:r>
+        <w:t>Figura 3. Evoluci</w:t>
+      </w:r>
+      <w:r>
+        <w:t>ó</w:t>
+      </w:r>
+      <w:r>
+        <w:t>n del tiempo promedio y m</w:t>
+      </w:r>
+      <w:r>
+        <w:t>á</w:t>
+      </w:r>
+      <w:r>
+        <w:t>ximo de preparaci</w:t>
+      </w:r>
+      <w:r>
+        <w:t>ó</w:t>
+      </w:r>
+      <w:r>
+        <w:t>n por pedido.</w:t>
+      </w:r>
+    </w:p>
+    <w:p>
+      <w:r>
+        <w:rPr>
+          <w:noProof/>
+        </w:rPr>
+        <w:drawing>
+          <wp:inline distT="0" distB="0" distL="0" distR="0" wp14:anchorId="4C04202E" wp14:editId="55537254">
+            <wp:extent cx="5760720" cy="3275964"/>
+            <wp:effectExtent l="0" t="0" r="0" b="0"/>
+            <wp:docPr id="4" name="Picture 4"/>
+            <wp:cNvGraphicFramePr>
+              <a:graphicFrameLocks xmlns:a="http://schemas.openxmlformats.org/drawingml/2006/main" noChangeAspect="1"/>
+            </wp:cNvGraphicFramePr>
+            <a:graphic xmlns:a="http://schemas.openxmlformats.org/drawingml/2006/main">
+              <a:graphicData uri="http://schemas.openxmlformats.org/drawingml/2006/picture">
+                <pic:pic xmlns:pic="http://schemas.openxmlformats.org/drawingml/2006/picture">
+                  <pic:nvPicPr>
+                    <pic:cNvPr id="0" name="grafico_colas_modelica.png"/>
+                    <pic:cNvPicPr/>
+                  </pic:nvPicPr>
+                  <pic:blipFill>
+                    <a:blip r:embed="rId11"/>
+                    <a:stretch>
+                      <a:fillRect/>
+                    </a:stretch>
+                  </pic:blipFill>
+                  <pic:spPr>
+                    <a:xfrm>
+                      <a:off x="0" y="0"/>
+                      <a:ext cx="5760720" cy="3275964"/>
+                    </a:xfrm>
+                    <a:prstGeom prst="rect">
+                      <a:avLst/>
+                    </a:prstGeom>
+                  </pic:spPr>
+                </pic:pic>
+              </a:graphicData>
+            </a:graphic>
+          </wp:inline>
+        </w:drawing>
+      </w:r>
+    </w:p>
+    <w:p>
+      <w:r>
+        <w:t>Figura 4. Evoluci</w:t>
+      </w:r>
+      <w:r>
+        <w:t>ó</w:t>
+      </w:r>
+      <w:r>
+        <w:t>n de las colas de cocci</w:t>
+      </w:r>
+      <w:r>
+        <w:t>ó</w:t>
+      </w:r>
+      <w:r>
+        <w:t>n y armado.</w:t>
+      </w:r>
+    </w:p>
+    <w:p>
       <w:pPr>
         <w:pStyle w:val="Heading2"/>
       </w:pPr>
@@ -2387,6 +2495,11 @@
     <w:p>
       <w:r>
         <w:t>El resultado también indica que agregar cocineros tiene rendimientos decrecientes. Esto es coherente con la simplificación adoptada: el personal adicional reduce la atención manual, pero no aumenta la capacidad agregada de planchas ni la cantidad de puestos de armado. En consecuencia, una decisión real debería considerar costo laboral, frecuencia de eventos extraordinarios y posibles mejoras en armado o coordinación.</w:t>
+      </w:r>
+    </w:p>
+    <w:p>
+      <w:r>
+        <w:t>Adicionalmente se probó un escenario con tres planchas, aumentando la capacidad agregada de 40 a 60 hamburguesas por tanda. Los resultados no modificaron de forma apreciable el tiempo promedio: con la demanda modelada, la cola de cocción ya era prácticamente nula con dos planchas. Esto indica que el cuello de botella no se encuentra principalmente en la superficie de plancha, sino en etapas posteriores como armado, empaque, reposición y coordinación manual.</w:t>
       </w:r>
     </w:p>
     <w:p>
@@ -2480,19 +2593,11 @@
     </w:p>
     <w:p>
       <w:r>
-        <w:t xml:space="preserve">integrador.mo contiene el modelo; analisis_estadistico.py automatiza las réplicas pareadas; resultados_estadisticos.csv conserva corridas y resúmenes. Ejecución: </w:t>
-      </w:r>
-      <w:proofErr w:type="spellStart"/>
-      <w:r>
-        <w:t>python</w:t>
-      </w:r>
-      <w:proofErr w:type="spellEnd"/>
-      <w:r>
-        <w:t xml:space="preserve"> analisis_estadistico.py.</w:t>
+        <w:t>integrador.mo contiene el modelo; analisis_estadistico.py automatiza las réplicas pareadas; resultados_estadisticos.csv conserva corridas y resúmenes. Ejecución: python analisis_estadistico.py.</w:t>
       </w:r>
     </w:p>
     <w:sectPr>
-      <w:footerReference w:type="default" r:id="rId9"/>
+      <w:footerReference w:type="default" r:id="rId12"/>
       <w:pgSz w:w="11906" w:h="16838"/>
       <w:pgMar w:top="822" w:right="879" w:bottom="765" w:left="879" w:header="720" w:footer="720" w:gutter="0"/>
       <w:cols w:space="720"/>
@@ -2769,6 +2874,119 @@
       </w:rPr>
     </w:lvl>
   </w:abstractNum>
+  <w:abstractNum w:abstractNumId="9" w15:restartNumberingAfterBreak="0">
+    <w:nsid w:val="07A50581"/>
+    <w:multiLevelType w:val="hybridMultilevel"/>
+    <w:tmpl w:val="B2EC9616"/>
+    <w:lvl w:ilvl="0" w:tplc="2C0A0001">
+      <w:start w:val="1"/>
+      <w:numFmt w:val="bullet"/>
+      <w:lvlText w:val=""/>
+      <w:lvlJc w:val="left"/>
+      <w:pPr>
+        <w:ind w:left="862" w:hanging="360"/>
+      </w:pPr>
+      <w:rPr>
+        <w:rFonts w:ascii="Symbol" w:hAnsi="Symbol" w:hint="default"/>
+      </w:rPr>
+    </w:lvl>
+    <w:lvl w:ilvl="1" w:tplc="2C0A0003" w:tentative="1">
+      <w:start w:val="1"/>
+      <w:numFmt w:val="bullet"/>
+      <w:lvlText w:val="o"/>
+      <w:lvlJc w:val="left"/>
+      <w:pPr>
+        <w:ind w:left="1582" w:hanging="360"/>
+      </w:pPr>
+      <w:rPr>
+        <w:rFonts w:ascii="Courier New" w:hAnsi="Courier New" w:cs="Courier New" w:hint="default"/>
+      </w:rPr>
+    </w:lvl>
+    <w:lvl w:ilvl="2" w:tplc="2C0A0005" w:tentative="1">
+      <w:start w:val="1"/>
+      <w:numFmt w:val="bullet"/>
+      <w:lvlText w:val=""/>
+      <w:lvlJc w:val="left"/>
+      <w:pPr>
+        <w:ind w:left="2302" w:hanging="360"/>
+      </w:pPr>
+      <w:rPr>
+        <w:rFonts w:ascii="Wingdings" w:hAnsi="Wingdings" w:hint="default"/>
+      </w:rPr>
+    </w:lvl>
+    <w:lvl w:ilvl="3" w:tplc="2C0A0001" w:tentative="1">
+      <w:start w:val="1"/>
+      <w:numFmt w:val="bullet"/>
+      <w:lvlText w:val=""/>
+      <w:lvlJc w:val="left"/>
+      <w:pPr>
+        <w:ind w:left="3022" w:hanging="360"/>
+      </w:pPr>
+      <w:rPr>
+        <w:rFonts w:ascii="Symbol" w:hAnsi="Symbol" w:hint="default"/>
+      </w:rPr>
+    </w:lvl>
+    <w:lvl w:ilvl="4" w:tplc="2C0A0003" w:tentative="1">
+      <w:start w:val="1"/>
+      <w:numFmt w:val="bullet"/>
+      <w:lvlText w:val="o"/>
+      <w:lvlJc w:val="left"/>
+      <w:pPr>
+        <w:ind w:left="3742" w:hanging="360"/>
+      </w:pPr>
+      <w:rPr>
+        <w:rFonts w:ascii="Courier New" w:hAnsi="Courier New" w:cs="Courier New" w:hint="default"/>
+      </w:rPr>
+    </w:lvl>
+    <w:lvl w:ilvl="5" w:tplc="2C0A0005" w:tentative="1">
+      <w:start w:val="1"/>
+      <w:numFmt w:val="bullet"/>
+      <w:lvlText w:val=""/>
+      <w:lvlJc w:val="left"/>
+      <w:pPr>
+        <w:ind w:left="4462" w:hanging="360"/>
+      </w:pPr>
+      <w:rPr>
+        <w:rFonts w:ascii="Wingdings" w:hAnsi="Wingdings" w:hint="default"/>
+      </w:rPr>
+    </w:lvl>
+    <w:lvl w:ilvl="6" w:tplc="2C0A0001" w:tentative="1">
+      <w:start w:val="1"/>
+      <w:numFmt w:val="bullet"/>
+      <w:lvlText w:val=""/>
+      <w:lvlJc w:val="left"/>
+      <w:pPr>
+        <w:ind w:left="5182" w:hanging="360"/>
+      </w:pPr>
+      <w:rPr>
+        <w:rFonts w:ascii="Symbol" w:hAnsi="Symbol" w:hint="default"/>
+      </w:rPr>
+    </w:lvl>
+    <w:lvl w:ilvl="7" w:tplc="2C0A0003" w:tentative="1">
+      <w:start w:val="1"/>
+      <w:numFmt w:val="bullet"/>
+      <w:lvlText w:val="o"/>
+      <w:lvlJc w:val="left"/>
+      <w:pPr>
+        <w:ind w:left="5902" w:hanging="360"/>
+      </w:pPr>
+      <w:rPr>
+        <w:rFonts w:ascii="Courier New" w:hAnsi="Courier New" w:cs="Courier New" w:hint="default"/>
+      </w:rPr>
+    </w:lvl>
+    <w:lvl w:ilvl="8" w:tplc="2C0A0005" w:tentative="1">
+      <w:start w:val="1"/>
+      <w:numFmt w:val="bullet"/>
+      <w:lvlText w:val=""/>
+      <w:lvlJc w:val="left"/>
+      <w:pPr>
+        <w:ind w:left="6622" w:hanging="360"/>
+      </w:pPr>
+      <w:rPr>
+        <w:rFonts w:ascii="Wingdings" w:hAnsi="Wingdings" w:hint="default"/>
+      </w:rPr>
+    </w:lvl>
+  </w:abstractNum>
   <w:num w:numId="1" w16cid:durableId="1484085253">
     <w:abstractNumId w:val="8"/>
   </w:num>
@@ -2795,6 +3013,9 @@
   </w:num>
   <w:num w:numId="9" w16cid:durableId="1465270547">
     <w:abstractNumId w:val="0"/>
+  </w:num>
+  <w:num w:numId="10" w16cid:durableId="1030447477">
+    <w:abstractNumId w:val="9"/>
   </w:num>
 </w:numbering>
 </file>

</xml_diff>